<commit_message>
Flotsam Cache manual: cache limit in GB / % replaces the hours timeout
New "How big the asset cache can get" section: 5 GB / 1 GB / % of free
space rule, 15-minute trim of the least-used files, cache folder on another
drive. Script Cache paragraph no longer claims .State files are kept
(YEngine clears every file). Screenshot still shows the old Timeout box.

Co-Authored-By: Claude Opus 5.5 <noreply@anthropic.com>
</commit_message>
<xml_diff>
--- a/Flotsam Cache.docx
+++ b/Flotsam Cache.docx
@@ -119,39 +119,130 @@
           <w:rFonts w:ascii="Times New Roman" w:hAnsi="Times New Roman"/>
           <w:highlight w:val="white"/>
         </w:rPr>
-        <w:t>Script Cache will all of the compiled DLL’s</w:t>
+        <w:t xml:space="preserve">Script Cache holds all of the compiled scripts. Clearing it deletes them all, and each script compiles again the next time its region starts. That is why it can only be cleared while OpenSimulator is stopped.</w:t>
+      </w:r>
+    </w:p>
+    <w:p>
+      <w:pPr>
+        <w:ind w:left="720" w:right="720"/>
+        <w:rPr>
+          <w:rFonts w:ascii="Times New Roman" w:hAnsi="Times New Roman"/>
+          <w:highlight w:val="white"/>
+        </w:rPr>
+      </w:pPr>
+      <w:r>
+        <w:rPr>
+          <w:rFonts w:ascii="Times New Roman" w:hAnsi="Times New Roman"/>
+          <w:highlight w:val="white"/>
+        </w:rPr>
+        <w:t xml:space="preserve">Avatar Bakes cache holds the combined layers of the avatars.  These consists of the Skin, Alpha, </w:t>
+      </w:r>
+      <w:proofErr w:type="spellStart"/>
+      <w:r>
+        <w:rPr>
+          <w:rFonts w:ascii="Times New Roman" w:hAnsi="Times New Roman"/>
+          <w:highlight w:val="white"/>
+        </w:rPr>
+        <w:t>Tatoo</w:t>
+      </w:r>
+      <w:proofErr w:type="spellEnd"/>
+      <w:r>
+        <w:rPr>
+          <w:rFonts w:ascii="Times New Roman" w:hAnsi="Times New Roman"/>
+          <w:highlight w:val="white"/>
+        </w:rPr>
+        <w:t xml:space="preserve">, and other layers.  </w:t>
+      </w:r>
+    </w:p>
+    <w:p>
+      <w:pPr>
+        <w:ind w:left="720" w:right="720"/>
+        <w:rPr>
+          <w:rFonts w:ascii="Times New Roman" w:hAnsi="Times New Roman"/>
+        </w:rPr>
+      </w:pPr>
+      <w:r>
+        <w:rPr>
+          <w:rFonts w:ascii="Times New Roman" w:hAnsi="Times New Roman"/>
+          <w:highlight w:val="white"/>
+        </w:rPr>
+        <w:t>Asset Cache</w:t>
+      </w:r>
+      <w:r>
+        <w:rPr>
+          <w:rFonts w:ascii="Times New Roman" w:hAnsi="Times New Roman"/>
+        </w:rPr>
+        <w:t xml:space="preserve"> stores the prims and meshes.</w:t>
+      </w:r>
+    </w:p>
+    <w:p>
+      <w:pPr>
+        <w:ind w:left="720" w:right="720"/>
+        <w:rPr>
+          <w:rFonts w:ascii="Times New Roman" w:hAnsi="Times New Roman"/>
+        </w:rPr>
+      </w:pPr>
+      <w:r>
+        <w:rPr>
+          <w:rFonts w:ascii="Times New Roman" w:hAnsi="Times New Roman"/>
+        </w:rPr>
+        <w:t xml:space="preserve">Image </w:t>
       </w:r>
       <w:proofErr w:type="gramStart"/>
       <w:r>
         <w:rPr>
           <w:rFonts w:ascii="Times New Roman" w:hAnsi="Times New Roman"/>
-          <w:highlight w:val="white"/>
-        </w:rPr>
-        <w:t xml:space="preserve"> It</w:t>
+        </w:rPr>
+        <w:t>cache stores</w:t>
       </w:r>
       <w:proofErr w:type="gramEnd"/>
       <w:r>
         <w:rPr>
           <w:rFonts w:ascii="Times New Roman" w:hAnsi="Times New Roman"/>
-          <w:highlight w:val="white"/>
-        </w:rPr>
-        <w:t xml:space="preserve"> preserves </w:t>
+        </w:rPr>
+        <w:t xml:space="preserve"> the images.</w:t>
+      </w:r>
+    </w:p>
+    <w:p>
+      <w:pPr>
+        <w:ind w:left="720" w:right="720"/>
+        <w:rPr>
+          <w:rFonts w:ascii="Times New Roman" w:hAnsi="Times New Roman"/>
+        </w:rPr>
+      </w:pPr>
+      <w:r>
+        <w:rPr>
+          <w:rFonts w:ascii="Times New Roman" w:hAnsi="Times New Roman"/>
+        </w:rPr>
+        <w:t xml:space="preserve">Users Cache </w:t>
       </w:r>
       <w:proofErr w:type="gramStart"/>
       <w:r>
         <w:rPr>
           <w:rFonts w:ascii="Times New Roman" w:hAnsi="Times New Roman"/>
-          <w:highlight w:val="white"/>
-        </w:rPr>
-        <w:t>the .State</w:t>
+        </w:rPr>
+        <w:t>maintains</w:t>
       </w:r>
       <w:proofErr w:type="gramEnd"/>
       <w:r>
         <w:rPr>
           <w:rFonts w:ascii="Times New Roman" w:hAnsi="Times New Roman"/>
-          <w:highlight w:val="white"/>
-        </w:rPr>
-        <w:t xml:space="preserve"> files that keeps the system in sync with the last thing the script was doing.</w:t>
+        </w:rPr>
+        <w:t xml:space="preserve"> the Users home location, and other important parameters. This is a last resort </w:t>
+      </w:r>
+      <w:proofErr w:type="gramStart"/>
+      <w:r>
+        <w:rPr>
+          <w:rFonts w:ascii="Times New Roman" w:hAnsi="Times New Roman"/>
+        </w:rPr>
+        <w:t>caches</w:t>
+      </w:r>
+      <w:proofErr w:type="gramEnd"/>
+      <w:r>
+        <w:rPr>
+          <w:rFonts w:ascii="Times New Roman" w:hAnsi="Times New Roman"/>
+        </w:rPr>
+        <w:t xml:space="preserve"> that will clear ALL user data except login data.</w:t>
       </w:r>
     </w:p>
     <w:p>
@@ -163,27 +254,36 @@
         </w:rPr>
       </w:pPr>
       <w:r>
-        <w:rPr>
-          <w:rFonts w:ascii="Times New Roman" w:hAnsi="Times New Roman"/>
-          <w:highlight w:val="white"/>
-        </w:rPr>
-        <w:t xml:space="preserve">Avatar Bakes cache holds the combined layers of the avatars.  These consists of the Skin, Alpha, </w:t>
-      </w:r>
-      <w:proofErr w:type="spellStart"/>
-      <w:r>
-        <w:rPr>
-          <w:rFonts w:ascii="Times New Roman" w:hAnsi="Times New Roman"/>
-          <w:highlight w:val="white"/>
-        </w:rPr>
-        <w:t>Tatoo</w:t>
-      </w:r>
-      <w:proofErr w:type="spellEnd"/>
-      <w:r>
-        <w:rPr>
-          <w:rFonts w:ascii="Times New Roman" w:hAnsi="Times New Roman"/>
-          <w:highlight w:val="white"/>
-        </w:rPr>
-        <w:t xml:space="preserve">, and other layers.  </w:t>
+        <w:t xml:space="preserve">Flotsam </w:t>
+      </w:r>
+      <w:proofErr w:type="gramStart"/>
+      <w:r>
+        <w:t>asset cache</w:t>
+      </w:r>
+      <w:r>
+        <w:t xml:space="preserve"> </w:t>
+      </w:r>
+      <w:r>
+        <w:rPr>
+          <w:rFonts w:ascii="Times New Roman" w:hAnsi="Times New Roman"/>
+          <w:highlight w:val="white"/>
+        </w:rPr>
+        <w:t>stores</w:t>
+      </w:r>
+      <w:proofErr w:type="gramEnd"/>
+      <w:r>
+        <w:rPr>
+          <w:rFonts w:ascii="Times New Roman" w:hAnsi="Times New Roman"/>
+          <w:highlight w:val="white"/>
+        </w:rPr>
+        <w:t xml:space="preserve"> assets on disk</w:t>
+      </w:r>
+      <w:r>
+        <w:rPr>
+          <w:rFonts w:ascii="Times New Roman" w:hAnsi="Times New Roman"/>
+          <w:highlight w:val="white"/>
+        </w:rPr>
+        <w:t>.</w:t>
       </w:r>
     </w:p>
     <w:p>
@@ -191,20 +291,23 @@
         <w:ind w:left="720" w:right="720"/>
         <w:rPr>
           <w:rFonts w:ascii="Times New Roman" w:hAnsi="Times New Roman"/>
-        </w:rPr>
-      </w:pPr>
-      <w:r>
-        <w:rPr>
-          <w:rFonts w:ascii="Times New Roman" w:hAnsi="Times New Roman"/>
-          <w:highlight w:val="white"/>
-        </w:rPr>
-        <w:t>Asset Cache</w:t>
-      </w:r>
-      <w:r>
-        <w:rPr>
-          <w:rFonts w:ascii="Times New Roman" w:hAnsi="Times New Roman"/>
-        </w:rPr>
-        <w:t xml:space="preserve"> stores the prims and meshes.</w:t>
+          <w:highlight w:val="white"/>
+        </w:rPr>
+      </w:pPr>
+      <w:r>
+        <w:rPr>
+          <w:rFonts w:ascii="Times New Roman" w:hAnsi="Times New Roman"/>
+          <w:highlight w:val="white"/>
+        </w:rPr>
+        <w:t xml:space="preserve">DreamGrid keeps the asset cache from growing too large. You set the limit on this screen.</w:t>
+      </w:r>
+    </w:p>
+    <w:p>
+      <w:pPr>
+        <w:pStyle w:val="Heading2"/>
+      </w:pPr>
+      <w:r>
+        <w:t>How big the asset cache can get</w:t>
       </w:r>
     </w:p>
     <w:p>
@@ -212,27 +315,15 @@
         <w:ind w:left="720" w:right="720"/>
         <w:rPr>
           <w:rFonts w:ascii="Times New Roman" w:hAnsi="Times New Roman"/>
-        </w:rPr>
-      </w:pPr>
-      <w:r>
-        <w:rPr>
-          <w:rFonts w:ascii="Times New Roman" w:hAnsi="Times New Roman"/>
-        </w:rPr>
-        <w:t xml:space="preserve">Image </w:t>
-      </w:r>
-      <w:proofErr w:type="gramStart"/>
-      <w:r>
-        <w:rPr>
-          <w:rFonts w:ascii="Times New Roman" w:hAnsi="Times New Roman"/>
-        </w:rPr>
-        <w:t>cache stores</w:t>
-      </w:r>
-      <w:proofErr w:type="gramEnd"/>
-      <w:r>
-        <w:rPr>
-          <w:rFonts w:ascii="Times New Roman" w:hAnsi="Times New Roman"/>
-        </w:rPr>
-        <w:t xml:space="preserve"> the images.</w:t>
+          <w:highlight w:val="white"/>
+        </w:rPr>
+      </w:pPr>
+      <w:r>
+        <w:rPr>
+          <w:rFonts w:ascii="Times New Roman" w:hAnsi="Times New Roman"/>
+          <w:highlight w:val="white"/>
+        </w:rPr>
+        <w:t xml:space="preserve">All of your regions share one asset cache. Every 15 minutes, DreamGrid checks how big it is. If it is over the limit, DreamGrid deletes the files that have gone unused the longest, until the cache is a little under the limit.</w:t>
       </w:r>
     </w:p>
     <w:p>
@@ -240,41 +331,15 @@
         <w:ind w:left="720" w:right="720"/>
         <w:rPr>
           <w:rFonts w:ascii="Times New Roman" w:hAnsi="Times New Roman"/>
-        </w:rPr>
-      </w:pPr>
-      <w:r>
-        <w:rPr>
-          <w:rFonts w:ascii="Times New Roman" w:hAnsi="Times New Roman"/>
-        </w:rPr>
-        <w:t xml:space="preserve">Users Cache </w:t>
-      </w:r>
-      <w:proofErr w:type="gramStart"/>
-      <w:r>
-        <w:rPr>
-          <w:rFonts w:ascii="Times New Roman" w:hAnsi="Times New Roman"/>
-        </w:rPr>
-        <w:t>maintains</w:t>
-      </w:r>
-      <w:proofErr w:type="gramEnd"/>
-      <w:r>
-        <w:rPr>
-          <w:rFonts w:ascii="Times New Roman" w:hAnsi="Times New Roman"/>
-        </w:rPr>
-        <w:t xml:space="preserve"> the Users home location, and other important parameters. This is a last resort </w:t>
-      </w:r>
-      <w:proofErr w:type="gramStart"/>
-      <w:r>
-        <w:rPr>
-          <w:rFonts w:ascii="Times New Roman" w:hAnsi="Times New Roman"/>
-        </w:rPr>
-        <w:t>caches</w:t>
-      </w:r>
-      <w:proofErr w:type="gramEnd"/>
-      <w:r>
-        <w:rPr>
-          <w:rFonts w:ascii="Times New Roman" w:hAnsi="Times New Roman"/>
-        </w:rPr>
-        <w:t xml:space="preserve"> that will clear ALL user data except login data.</w:t>
+          <w:highlight w:val="white"/>
+        </w:rPr>
+      </w:pPr>
+      <w:r>
+        <w:rPr>
+          <w:rFonts w:ascii="Times New Roman" w:hAnsi="Times New Roman"/>
+          <w:highlight w:val="white"/>
+        </w:rPr>
+        <w:t xml:space="preserve">The limit depends on how much free space is left on the drive that holds the cache:</w:t>
       </w:r>
     </w:p>
     <w:p>
@@ -286,36 +351,11 @@
         </w:rPr>
       </w:pPr>
       <w:r>
-        <w:t xml:space="preserve">Flotsam </w:t>
-      </w:r>
-      <w:proofErr w:type="gramStart"/>
-      <w:r>
-        <w:t>asset cache</w:t>
-      </w:r>
-      <w:r>
-        <w:t xml:space="preserve"> </w:t>
-      </w:r>
-      <w:r>
-        <w:rPr>
-          <w:rFonts w:ascii="Times New Roman" w:hAnsi="Times New Roman"/>
-          <w:highlight w:val="white"/>
-        </w:rPr>
-        <w:t>stores</w:t>
-      </w:r>
-      <w:proofErr w:type="gramEnd"/>
-      <w:r>
-        <w:rPr>
-          <w:rFonts w:ascii="Times New Roman" w:hAnsi="Times New Roman"/>
-          <w:highlight w:val="white"/>
-        </w:rPr>
-        <w:t xml:space="preserve"> assets on disk</w:t>
-      </w:r>
-      <w:r>
-        <w:rPr>
-          <w:rFonts w:ascii="Times New Roman" w:hAnsi="Times New Roman"/>
-          <w:highlight w:val="white"/>
-        </w:rPr>
-        <w:t>.</w:t>
+        <w:rPr>
+          <w:rFonts w:ascii="Times New Roman" w:hAnsi="Times New Roman"/>
+          <w:highlight w:val="white"/>
+        </w:rPr>
+        <w:t xml:space="preserve">- If the drive has at least as much free space as the “GB largest cache size” box (5 GB unless you change it), the cache can grow to that size.</w:t>
       </w:r>
     </w:p>
     <w:p>
@@ -331,30 +371,71 @@
           <w:rFonts w:ascii="Times New Roman" w:hAnsi="Times New Roman"/>
           <w:highlight w:val="white"/>
         </w:rPr>
-        <w:t>T</w:t>
-      </w:r>
-      <w:r>
-        <w:rPr>
-          <w:rFonts w:ascii="Times New Roman" w:hAnsi="Times New Roman"/>
-          <w:highlight w:val="white"/>
-        </w:rPr>
-        <w:t>he amount of memory or filesystem storage used by the cache can only be limited via manual actions (wiping all or part of cached assets from the filesystem), by console commands (e.g. "</w:t>
-      </w:r>
-      <w:proofErr w:type="spellStart"/>
-      <w:r>
-        <w:rPr>
-          <w:rFonts w:ascii="Times New Roman" w:hAnsi="Times New Roman"/>
-          <w:highlight w:val="white"/>
-        </w:rPr>
-        <w:t>fcache</w:t>
-      </w:r>
-      <w:proofErr w:type="spellEnd"/>
-      <w:r>
-        <w:rPr>
-          <w:rFonts w:ascii="Times New Roman" w:hAnsi="Times New Roman"/>
-          <w:highlight w:val="white"/>
-        </w:rPr>
-        <w:t xml:space="preserve"> clear") or by timeout settings (e.g. FileCacheTimeout = 1 to automatically remove cache files not accessed for 1 hours). </w:t>
+        <w:t xml:space="preserve">- If the drive has less free space than that, the cache is kept to 1 GB.</w:t>
+      </w:r>
+    </w:p>
+    <w:p>
+      <w:pPr>
+        <w:ind w:left="720" w:right="720"/>
+        <w:rPr>
+          <w:rFonts w:ascii="Times New Roman" w:hAnsi="Times New Roman"/>
+          <w:highlight w:val="white"/>
+        </w:rPr>
+      </w:pPr>
+      <w:r>
+        <w:rPr>
+          <w:rFonts w:ascii="Times New Roman" w:hAnsi="Times New Roman"/>
+          <w:highlight w:val="white"/>
+        </w:rPr>
+        <w:t xml:space="preserve">- If the drive has less than 1 GB free, the cache is kept to the “% of free space” box (10 % unless you change it) of whatever space is left.</w:t>
+      </w:r>
+    </w:p>
+    <w:p>
+      <w:pPr>
+        <w:ind w:left="720" w:right="720"/>
+        <w:rPr>
+          <w:rFonts w:ascii="Times New Roman" w:hAnsi="Times New Roman"/>
+          <w:highlight w:val="white"/>
+        </w:rPr>
+      </w:pPr>
+      <w:r>
+        <w:rPr>
+          <w:rFonts w:ascii="Times New Roman" w:hAnsi="Times New Roman"/>
+          <w:highlight w:val="white"/>
+        </w:rPr>
+        <w:t xml:space="preserve">Deleting cache files is safe. When a region needs one of those assets again, it simply fetches it from the grid.</w:t>
+      </w:r>
+    </w:p>
+    <w:p>
+      <w:pPr>
+        <w:ind w:left="720" w:right="720"/>
+        <w:rPr>
+          <w:rFonts w:ascii="Times New Roman" w:hAnsi="Times New Roman"/>
+          <w:highlight w:val="white"/>
+        </w:rPr>
+      </w:pPr>
+      <w:r>
+        <w:rPr>
+          <w:rFonts w:ascii="Times New Roman" w:hAnsi="Times New Roman"/>
+          <w:highlight w:val="white"/>
+        </w:rPr>
+        <w:t xml:space="preserve">The Cache Directory box shows where the asset cache lives. Click the folder button to move it, for example to a bigger drive. The limit is then measured on that drive.</w:t>
+      </w:r>
+    </w:p>
+    <w:p>
+      <w:pPr>
+        <w:ind w:left="720" w:right="720"/>
+        <w:rPr>
+          <w:rFonts w:ascii="Times New Roman" w:hAnsi="Times New Roman"/>
+          <w:highlight w:val="white"/>
+        </w:rPr>
+      </w:pPr>
+      <w:r>
+        <w:rPr>
+          <w:rFonts w:ascii="Times New Roman" w:hAnsi="Times New Roman"/>
+          <w:highlight w:val="white"/>
+        </w:rPr>
+        <w:t xml:space="preserve">Older versions of DreamGrid had a “Timeout in hours” box instead. It is gone. OpenSimulator no longer cleans the cache itself: every region did it at the same moment, they got in each other’s way, and the logs filled with “Access to the path is denied” warnings.</w:t>
       </w:r>
     </w:p>
     <w:p>

</xml_diff>

<commit_message>
Flotsam Cache manual: new screenshot with the GB and % boxes
</commit_message>
<xml_diff>
--- a/Flotsam Cache.docx
+++ b/Flotsam Cache.docx
@@ -1,6 +1,6 @@
 
 <file path=word/document.xml><?xml version="1.0" encoding="utf-8"?>
-<w:document xmlns:wpc="http://schemas.microsoft.com/office/word/2010/wordprocessingCanvas" xmlns:cx="http://schemas.microsoft.com/office/drawing/2014/chartex" xmlns:cx1="http://schemas.microsoft.com/office/drawing/2015/9/8/chartex" xmlns:cx2="http://schemas.microsoft.com/office/drawing/2015/10/21/chartex" xmlns:cx3="http://schemas.microsoft.com/office/drawing/2016/5/9/chartex" xmlns:cx4="http://schemas.microsoft.com/office/drawing/2016/5/10/chartex" xmlns:cx5="http://schemas.microsoft.com/office/drawing/2016/5/11/chartex" xmlns:cx6="http://schemas.microsoft.com/office/drawing/2016/5/12/chartex" xmlns:cx7="http://schemas.microsoft.com/office/drawing/2016/5/13/chartex" xmlns:cx8="http://schemas.microsoft.com/office/drawing/2016/5/14/chartex" xmlns:mc="http://schemas.openxmlformats.org/markup-compatibility/2006" xmlns:aink="http://schemas.microsoft.com/office/drawing/2016/ink" xmlns:am3d="http://schemas.microsoft.com/office/drawing/2017/model3d" xmlns:o="urn:schemas-microsoft-com:office:office" xmlns:oel="http://schemas.microsoft.com/office/2019/extlst" xmlns:r="http://schemas.openxmlformats.org/officeDocument/2006/relationships" xmlns:m="http://schemas.openxmlformats.org/officeDocument/2006/math" xmlns:v="urn:schemas-microsoft-com:vml" xmlns:wp14="http://schemas.microsoft.com/office/word/2010/wordprocessingDrawing" xmlns:wp="http://schemas.openxmlformats.org/drawingml/2006/wordprocessingDrawing" xmlns:w10="urn:schemas-microsoft-com:office:word" xmlns:w="http://schemas.openxmlformats.org/wordprocessingml/2006/main" xmlns:w14="http://schemas.microsoft.com/office/word/2010/wordml" xmlns:w15="http://schemas.microsoft.com/office/word/2012/wordml" xmlns:w16cex="http://schemas.microsoft.com/office/word/2018/wordml/cex" xmlns:w16cid="http://schemas.microsoft.com/office/word/2016/wordml/cid" xmlns:w16="http://schemas.microsoft.com/office/word/2018/wordml" xmlns:w16du="http://schemas.microsoft.com/office/word/2023/wordml/word16du" xmlns:w16sdtdh="http://schemas.microsoft.com/office/word/2020/wordml/sdtdatahash" xmlns:w16se="http://schemas.microsoft.com/office/word/2015/wordml/symex" xmlns:wpg="http://schemas.microsoft.com/office/word/2010/wordprocessingGroup" xmlns:wpi="http://schemas.microsoft.com/office/word/2010/wordprocessingInk" xmlns:wne="http://schemas.microsoft.com/office/word/2006/wordml" xmlns:wps="http://schemas.microsoft.com/office/word/2010/wordprocessingShape" mc:Ignorable="w14 w15 w16se w16cid w16 w16cex w16sdtdh w16du wp14">
+<w:document xmlns:wpc="http://schemas.microsoft.com/office/word/2010/wordprocessingCanvas" xmlns:cx="http://schemas.microsoft.com/office/drawing/2014/chartex" xmlns:cx1="http://schemas.microsoft.com/office/drawing/2015/9/8/chartex" xmlns:cx2="http://schemas.microsoft.com/office/drawing/2015/10/21/chartex" xmlns:cx3="http://schemas.microsoft.com/office/drawing/2016/5/9/chartex" xmlns:cx4="http://schemas.microsoft.com/office/drawing/2016/5/10/chartex" xmlns:cx5="http://schemas.microsoft.com/office/drawing/2016/5/11/chartex" xmlns:cx6="http://schemas.microsoft.com/office/drawing/2016/5/12/chartex" xmlns:cx7="http://schemas.microsoft.com/office/drawing/2016/5/13/chartex" xmlns:cx8="http://schemas.microsoft.com/office/drawing/2016/5/14/chartex" xmlns:mc="http://schemas.openxmlformats.org/markup-compatibility/2006" xmlns:aink="http://schemas.microsoft.com/office/drawing/2016/ink" xmlns:am3d="http://schemas.microsoft.com/office/drawing/2017/model3d" xmlns:o="urn:schemas-microsoft-com:office:office" xmlns:oel="http://schemas.microsoft.com/office/2019/extlst" xmlns:r="http://schemas.openxmlformats.org/officeDocument/2006/relationships" xmlns:m="http://schemas.openxmlformats.org/officeDocument/2006/math" xmlns:v="urn:schemas-microsoft-com:vml" xmlns:wp14="http://schemas.microsoft.com/office/word/2010/wordprocessingDrawing" xmlns:wp="http://schemas.openxmlformats.org/drawingml/2006/wordprocessingDrawing" xmlns:w10="urn:schemas-microsoft-com:office:word" xmlns:w="http://schemas.openxmlformats.org/wordprocessingml/2006/main" xmlns:w14="http://schemas.microsoft.com/office/word/2010/wordml" xmlns:w15="http://schemas.microsoft.com/office/word/2012/wordml" xmlns:w16cex="http://schemas.microsoft.com/office/word/2018/wordml/cex" xmlns:w16cid="http://schemas.microsoft.com/office/word/2016/wordml/cid" xmlns:w16="http://schemas.microsoft.com/office/word/2018/wordml" xmlns:w16du="http://schemas.microsoft.com/office/word/2023/wordml/word16du" xmlns:w16sdtdh="http://schemas.microsoft.com/office/word/2020/wordml/sdtdatahash" xmlns:w16sdtfl="http://schemas.microsoft.com/office/word/2024/wordml/sdtformatlock" xmlns:w16se="http://schemas.microsoft.com/office/word/2015/wordml/symex" xmlns:wpg="http://schemas.microsoft.com/office/word/2010/wordprocessingGroup" xmlns:wpi="http://schemas.microsoft.com/office/word/2010/wordprocessingInk" xmlns:wne="http://schemas.microsoft.com/office/word/2006/wordml" xmlns:wps="http://schemas.microsoft.com/office/word/2010/wordprocessingShape" mc:Ignorable="w14 w15 w16se w16cid w16 w16cex w16sdtdh w16sdtfl w16du wp14">
   <w:body>
     <w:p>
       <w:pPr>
@@ -33,47 +33,37 @@
         <w:br/>
         <w:t xml:space="preserve">OpenSimulator has an asset cache that stores the assets retrieved from an asset service. This reduces the load on </w:t>
       </w:r>
-      <w:proofErr w:type="gramStart"/>
-      <w:r>
-        <w:rPr>
-          <w:rFonts w:ascii="Times New Roman" w:hAnsi="Times New Roman"/>
-          <w:highlight w:val="white"/>
-        </w:rPr>
-        <w:t>a</w:t>
-      </w:r>
-      <w:proofErr w:type="gramEnd"/>
-      <w:r>
-        <w:rPr>
-          <w:rFonts w:ascii="Times New Roman" w:hAnsi="Times New Roman"/>
-          <w:highlight w:val="white"/>
-        </w:rPr>
-        <w:t xml:space="preserve"> asset service and improves OpenSimulator responsiveness.</w:t>
-      </w:r>
-      <w:r>
-        <w:rPr>
-          <w:rFonts w:ascii="Times New Roman" w:hAnsi="Times New Roman"/>
-          <w:highlight w:val="white"/>
-        </w:rPr>
-        <w:t xml:space="preserve">  </w:t>
-      </w:r>
-    </w:p>
-    <w:p>
-      <w:pPr>
-        <w:ind w:left="720" w:right="720"/>
-        <w:rPr>
-          <w:rFonts w:ascii="Times New Roman" w:hAnsi="Times New Roman"/>
-          <w:highlight w:val="white"/>
-        </w:rPr>
-      </w:pPr>
-      <w:r>
-        <w:rPr>
-          <w:rFonts w:ascii="Times New Roman" w:hAnsi="Times New Roman"/>
+      <w:r>
+        <w:rPr>
+          <w:rFonts w:ascii="Times New Roman" w:hAnsi="Times New Roman"/>
+          <w:highlight w:val="white"/>
+        </w:rPr>
+        <w:t>an</w:t>
+      </w:r>
+      <w:r>
+        <w:rPr>
+          <w:rFonts w:ascii="Times New Roman" w:hAnsi="Times New Roman"/>
+          <w:highlight w:val="white"/>
+        </w:rPr>
+        <w:t xml:space="preserve"> asset service and improves OpenSimulator responsiveness</w:t>
+      </w:r>
+      <w:r>
+        <w:rPr>
+          <w:rFonts w:ascii="Times New Roman" w:hAnsi="Times New Roman"/>
+          <w:highlight w:val="white"/>
+        </w:rPr>
+        <w:t xml:space="preserve">. </w:t>
+      </w:r>
+      <w:r>
+        <w:rPr>
+          <w:rFonts w:ascii="Times New Roman" w:hAnsi="Times New Roman"/>
+          <w:noProof/>
         </w:rPr>
         <w:drawing>
-          <wp:inline distT="0" distB="0" distL="0" distR="0" wp14:anchorId="105CB0DB" wp14:editId="56B8E399">
-            <wp:extent cx="5915851" cy="2724530"/>
-            <wp:effectExtent l="0" t="0" r="8890" b="0"/>
-            <wp:docPr id="561273342" name="Picture 1" descr="A screenshot of a computer&#10;&#10;Description automatically generated"/>
+          <wp:inline distT="0" distB="0" distL="0" distR="0" wp14:anchorId="3AE8086B" wp14:editId="21183363">
+            <wp:extent cx="5943600" cy="3252470"/>
+            <wp:effectExtent l="0" t="0" r="0" b="0"/>
+            <wp:docPr id="191374053" name="Picture 1"/>
             <wp:cNvGraphicFramePr>
               <a:graphicFrameLocks xmlns:a="http://schemas.openxmlformats.org/drawingml/2006/main" noChangeAspect="1"/>
             </wp:cNvGraphicFramePr>
@@ -81,7 +71,7 @@
               <a:graphicData uri="http://schemas.openxmlformats.org/drawingml/2006/picture">
                 <pic:pic xmlns:pic="http://schemas.openxmlformats.org/drawingml/2006/picture">
                   <pic:nvPicPr>
-                    <pic:cNvPr id="561273342" name="Picture 1" descr="A screenshot of a computer&#10;&#10;Description automatically generated"/>
+                    <pic:cNvPr id="191374053" name=""/>
                     <pic:cNvPicPr/>
                   </pic:nvPicPr>
                   <pic:blipFill>
@@ -93,7 +83,7 @@
                   <pic:spPr>
                     <a:xfrm>
                       <a:off x="0" y="0"/>
-                      <a:ext cx="5915851" cy="2724530"/>
+                      <a:ext cx="5943600" cy="3252470"/>
                     </a:xfrm>
                     <a:prstGeom prst="rect">
                       <a:avLst/>
@@ -105,6 +95,29 @@
           </wp:inline>
         </w:drawing>
       </w:r>
+      <w:r>
+        <w:rPr>
+          <w:rFonts w:ascii="Times New Roman" w:hAnsi="Times New Roman"/>
+          <w:highlight w:val="white"/>
+        </w:rPr>
+        <w:t xml:space="preserve">Script Cache holds </w:t>
+      </w:r>
+      <w:proofErr w:type="gramStart"/>
+      <w:r>
+        <w:rPr>
+          <w:rFonts w:ascii="Times New Roman" w:hAnsi="Times New Roman"/>
+          <w:highlight w:val="white"/>
+        </w:rPr>
+        <w:t>all of</w:t>
+      </w:r>
+      <w:proofErr w:type="gramEnd"/>
+      <w:r>
+        <w:rPr>
+          <w:rFonts w:ascii="Times New Roman" w:hAnsi="Times New Roman"/>
+          <w:highlight w:val="white"/>
+        </w:rPr>
+        <w:t xml:space="preserve"> the compiled scripts. Clearing it deletes them all, and each script compiles again the next time its region starts. That is why it can only be cleared while OpenSimulator is stopped.</w:t>
+      </w:r>
     </w:p>
     <w:p>
       <w:pPr>
@@ -119,7 +132,56 @@
           <w:rFonts w:ascii="Times New Roman" w:hAnsi="Times New Roman"/>
           <w:highlight w:val="white"/>
         </w:rPr>
-        <w:t xml:space="preserve">Script Cache holds all of the compiled scripts. Clearing it deletes them all, and each script compiles again the next time its region starts. That is why it can only be cleared while OpenSimulator is stopped.</w:t>
+        <w:t>Avatar Bakes cache holds the combined layers of the avatars</w:t>
+      </w:r>
+      <w:r>
+        <w:rPr>
+          <w:rFonts w:ascii="Times New Roman" w:hAnsi="Times New Roman"/>
+          <w:highlight w:val="white"/>
+        </w:rPr>
+        <w:t xml:space="preserve">. </w:t>
+      </w:r>
+      <w:r>
+        <w:rPr>
+          <w:rFonts w:ascii="Times New Roman" w:hAnsi="Times New Roman"/>
+          <w:highlight w:val="white"/>
+        </w:rPr>
+        <w:t xml:space="preserve">These </w:t>
+      </w:r>
+      <w:r>
+        <w:rPr>
+          <w:rFonts w:ascii="Times New Roman" w:hAnsi="Times New Roman"/>
+          <w:highlight w:val="white"/>
+        </w:rPr>
+        <w:t>consist</w:t>
+      </w:r>
+      <w:r>
+        <w:rPr>
+          <w:rFonts w:ascii="Times New Roman" w:hAnsi="Times New Roman"/>
+          <w:highlight w:val="white"/>
+        </w:rPr>
+        <w:t xml:space="preserve"> of the Skin, Alpha, Tat</w:t>
+      </w:r>
+      <w:r>
+        <w:rPr>
+          <w:rFonts w:ascii="Times New Roman" w:hAnsi="Times New Roman"/>
+          <w:highlight w:val="white"/>
+        </w:rPr>
+        <w:t>t</w:t>
+      </w:r>
+      <w:r>
+        <w:rPr>
+          <w:rFonts w:ascii="Times New Roman" w:hAnsi="Times New Roman"/>
+          <w:highlight w:val="white"/>
+        </w:rPr>
+        <w:t>oo, and other layers</w:t>
+      </w:r>
+      <w:r>
+        <w:rPr>
+          <w:rFonts w:ascii="Times New Roman" w:hAnsi="Times New Roman"/>
+          <w:highlight w:val="white"/>
+        </w:rPr>
+        <w:t xml:space="preserve">. </w:t>
       </w:r>
     </w:p>
     <w:p>
@@ -127,31 +189,20 @@
         <w:ind w:left="720" w:right="720"/>
         <w:rPr>
           <w:rFonts w:ascii="Times New Roman" w:hAnsi="Times New Roman"/>
-          <w:highlight w:val="white"/>
-        </w:rPr>
-      </w:pPr>
-      <w:r>
-        <w:rPr>
-          <w:rFonts w:ascii="Times New Roman" w:hAnsi="Times New Roman"/>
-          <w:highlight w:val="white"/>
-        </w:rPr>
-        <w:t xml:space="preserve">Avatar Bakes cache holds the combined layers of the avatars.  These consists of the Skin, Alpha, </w:t>
-      </w:r>
-      <w:proofErr w:type="spellStart"/>
-      <w:r>
-        <w:rPr>
-          <w:rFonts w:ascii="Times New Roman" w:hAnsi="Times New Roman"/>
-          <w:highlight w:val="white"/>
-        </w:rPr>
-        <w:t>Tatoo</w:t>
-      </w:r>
-      <w:proofErr w:type="spellEnd"/>
-      <w:r>
-        <w:rPr>
-          <w:rFonts w:ascii="Times New Roman" w:hAnsi="Times New Roman"/>
-          <w:highlight w:val="white"/>
-        </w:rPr>
-        <w:t xml:space="preserve">, and other layers.  </w:t>
+        </w:rPr>
+      </w:pPr>
+      <w:r>
+        <w:rPr>
+          <w:rFonts w:ascii="Times New Roman" w:hAnsi="Times New Roman"/>
+          <w:highlight w:val="white"/>
+        </w:rPr>
+        <w:t>Asset Cache</w:t>
+      </w:r>
+      <w:r>
+        <w:rPr>
+          <w:rFonts w:ascii="Times New Roman" w:hAnsi="Times New Roman"/>
+        </w:rPr>
+        <w:t xml:space="preserve"> stores the prims and meshes.</w:t>
       </w:r>
     </w:p>
     <w:p>
@@ -164,15 +215,20 @@
       <w:r>
         <w:rPr>
           <w:rFonts w:ascii="Times New Roman" w:hAnsi="Times New Roman"/>
-          <w:highlight w:val="white"/>
-        </w:rPr>
-        <w:t>Asset Cache</w:t>
-      </w:r>
-      <w:r>
-        <w:rPr>
-          <w:rFonts w:ascii="Times New Roman" w:hAnsi="Times New Roman"/>
-        </w:rPr>
-        <w:t xml:space="preserve"> stores the prims and meshes.</w:t>
+        </w:rPr>
+        <w:t xml:space="preserve">Image </w:t>
+      </w:r>
+      <w:r>
+        <w:rPr>
+          <w:rFonts w:ascii="Times New Roman" w:hAnsi="Times New Roman"/>
+        </w:rPr>
+        <w:t>catches</w:t>
+      </w:r>
+      <w:r>
+        <w:rPr>
+          <w:rFonts w:ascii="Times New Roman" w:hAnsi="Times New Roman"/>
+        </w:rPr>
+        <w:t xml:space="preserve"> the images.</w:t>
       </w:r>
     </w:p>
     <w:p>
@@ -186,21 +242,125 @@
         <w:rPr>
           <w:rFonts w:ascii="Times New Roman" w:hAnsi="Times New Roman"/>
         </w:rPr>
-        <w:t xml:space="preserve">Image </w:t>
-      </w:r>
+        <w:t>Users Cache maintains the Users home location, and other important parameters. This is a last resort cache</w:t>
+      </w:r>
+      <w:r>
+        <w:rPr>
+          <w:rFonts w:ascii="Times New Roman" w:hAnsi="Times New Roman"/>
+        </w:rPr>
+        <w:t xml:space="preserve"> </w:t>
+      </w:r>
+      <w:r>
+        <w:rPr>
+          <w:rFonts w:ascii="Times New Roman" w:hAnsi="Times New Roman"/>
+        </w:rPr>
+        <w:t>that will clear ALL user data except login data.</w:t>
+      </w:r>
+    </w:p>
+    <w:p>
+      <w:pPr>
+        <w:ind w:left="720" w:right="720"/>
+        <w:rPr>
+          <w:rFonts w:ascii="Times New Roman" w:hAnsi="Times New Roman"/>
+          <w:highlight w:val="white"/>
+        </w:rPr>
+      </w:pPr>
+      <w:r>
+        <w:t>Flotsam asset cache</w:t>
+      </w:r>
+      <w:r>
+        <w:t xml:space="preserve"> </w:t>
+      </w:r>
+      <w:r>
+        <w:rPr>
+          <w:rFonts w:ascii="Times New Roman" w:hAnsi="Times New Roman"/>
+          <w:highlight w:val="white"/>
+        </w:rPr>
+        <w:t>stores assets on disk</w:t>
+      </w:r>
+      <w:r>
+        <w:rPr>
+          <w:rFonts w:ascii="Times New Roman" w:hAnsi="Times New Roman"/>
+          <w:highlight w:val="white"/>
+        </w:rPr>
+        <w:t>.</w:t>
+      </w:r>
+    </w:p>
+    <w:p>
+      <w:pPr>
+        <w:ind w:left="720" w:right="720"/>
+        <w:rPr>
+          <w:rFonts w:ascii="Times New Roman" w:hAnsi="Times New Roman"/>
+          <w:highlight w:val="white"/>
+        </w:rPr>
+      </w:pPr>
+      <w:r>
+        <w:rPr>
+          <w:rFonts w:ascii="Times New Roman" w:hAnsi="Times New Roman"/>
+          <w:highlight w:val="white"/>
+        </w:rPr>
+        <w:t xml:space="preserve">DreamGrid keeps the asset </w:t>
+      </w:r>
+      <w:r>
+        <w:rPr>
+          <w:rFonts w:ascii="Times New Roman" w:hAnsi="Times New Roman"/>
+          <w:highlight w:val="white"/>
+        </w:rPr>
+        <w:t>cash</w:t>
+      </w:r>
+      <w:r>
+        <w:rPr>
+          <w:rFonts w:ascii="Times New Roman" w:hAnsi="Times New Roman"/>
+          <w:highlight w:val="white"/>
+        </w:rPr>
+        <w:t xml:space="preserve"> from growing too large. You set the limit on this screen.</w:t>
+      </w:r>
+    </w:p>
+    <w:p>
+      <w:pPr>
+        <w:pStyle w:val="Heading2"/>
+      </w:pPr>
+      <w:r>
+        <w:t>How big the asset cache can get</w:t>
+      </w:r>
+    </w:p>
+    <w:p>
+      <w:pPr>
+        <w:ind w:left="720" w:right="720"/>
+        <w:rPr>
+          <w:rFonts w:ascii="Times New Roman" w:hAnsi="Times New Roman"/>
+          <w:highlight w:val="white"/>
+        </w:rPr>
+      </w:pPr>
       <w:proofErr w:type="gramStart"/>
       <w:r>
         <w:rPr>
           <w:rFonts w:ascii="Times New Roman" w:hAnsi="Times New Roman"/>
-        </w:rPr>
-        <w:t>cache stores</w:t>
+          <w:highlight w:val="white"/>
+        </w:rPr>
+        <w:t>All of</w:t>
       </w:r>
       <w:proofErr w:type="gramEnd"/>
       <w:r>
         <w:rPr>
           <w:rFonts w:ascii="Times New Roman" w:hAnsi="Times New Roman"/>
-        </w:rPr>
-        <w:t xml:space="preserve"> the images.</w:t>
+          <w:highlight w:val="white"/>
+        </w:rPr>
+        <w:t xml:space="preserve"> your regions share one asset </w:t>
+      </w:r>
+      <w:r>
+        <w:rPr>
+          <w:rFonts w:ascii="Times New Roman" w:hAnsi="Times New Roman"/>
+          <w:highlight w:val="white"/>
+        </w:rPr>
+        <w:t>cash</w:t>
+      </w:r>
+      <w:r>
+        <w:rPr>
+          <w:rFonts w:ascii="Times New Roman" w:hAnsi="Times New Roman"/>
+          <w:highlight w:val="white"/>
+        </w:rPr>
+        <w:t>. Every 15 minutes, DreamGrid checks how big it is. If it is over the limit, DreamGrid deletes the files that have gone unused the longest, until the cache is a little under the limit.</w:t>
       </w:r>
     </w:p>
     <w:p>
@@ -208,41 +368,16 @@
         <w:ind w:left="720" w:right="720"/>
         <w:rPr>
           <w:rFonts w:ascii="Times New Roman" w:hAnsi="Times New Roman"/>
-        </w:rPr>
-      </w:pPr>
-      <w:r>
-        <w:rPr>
-          <w:rFonts w:ascii="Times New Roman" w:hAnsi="Times New Roman"/>
-        </w:rPr>
-        <w:t xml:space="preserve">Users Cache </w:t>
-      </w:r>
-      <w:proofErr w:type="gramStart"/>
-      <w:r>
-        <w:rPr>
-          <w:rFonts w:ascii="Times New Roman" w:hAnsi="Times New Roman"/>
-        </w:rPr>
-        <w:t>maintains</w:t>
-      </w:r>
-      <w:proofErr w:type="gramEnd"/>
-      <w:r>
-        <w:rPr>
-          <w:rFonts w:ascii="Times New Roman" w:hAnsi="Times New Roman"/>
-        </w:rPr>
-        <w:t xml:space="preserve"> the Users home location, and other important parameters. This is a last resort </w:t>
-      </w:r>
-      <w:proofErr w:type="gramStart"/>
-      <w:r>
-        <w:rPr>
-          <w:rFonts w:ascii="Times New Roman" w:hAnsi="Times New Roman"/>
-        </w:rPr>
-        <w:t>caches</w:t>
-      </w:r>
-      <w:proofErr w:type="gramEnd"/>
-      <w:r>
-        <w:rPr>
-          <w:rFonts w:ascii="Times New Roman" w:hAnsi="Times New Roman"/>
-        </w:rPr>
-        <w:t xml:space="preserve"> that will clear ALL user data except login data.</w:t>
+          <w:highlight w:val="white"/>
+        </w:rPr>
+      </w:pPr>
+      <w:r>
+        <w:rPr>
+          <w:rFonts w:ascii="Times New Roman" w:hAnsi="Times New Roman"/>
+          <w:highlight w:val="white"/>
+        </w:rPr>
+        <w:lastRenderedPageBreak/>
+        <w:t>The limit depends on how much free space is left on the drive that holds the cache:</w:t>
       </w:r>
     </w:p>
     <w:p>
@@ -254,36 +389,11 @@
         </w:rPr>
       </w:pPr>
       <w:r>
-        <w:t xml:space="preserve">Flotsam </w:t>
-      </w:r>
-      <w:proofErr w:type="gramStart"/>
-      <w:r>
-        <w:t>asset cache</w:t>
-      </w:r>
-      <w:r>
-        <w:t xml:space="preserve"> </w:t>
-      </w:r>
-      <w:r>
-        <w:rPr>
-          <w:rFonts w:ascii="Times New Roman" w:hAnsi="Times New Roman"/>
-          <w:highlight w:val="white"/>
-        </w:rPr>
-        <w:t>stores</w:t>
-      </w:r>
-      <w:proofErr w:type="gramEnd"/>
-      <w:r>
-        <w:rPr>
-          <w:rFonts w:ascii="Times New Roman" w:hAnsi="Times New Roman"/>
-          <w:highlight w:val="white"/>
-        </w:rPr>
-        <w:t xml:space="preserve"> assets on disk</w:t>
-      </w:r>
-      <w:r>
-        <w:rPr>
-          <w:rFonts w:ascii="Times New Roman" w:hAnsi="Times New Roman"/>
-          <w:highlight w:val="white"/>
-        </w:rPr>
-        <w:t>.</w:t>
+        <w:rPr>
+          <w:rFonts w:ascii="Times New Roman" w:hAnsi="Times New Roman"/>
+          <w:highlight w:val="white"/>
+        </w:rPr>
+        <w:t>- If the drive has at least as much free space as the “GB largest cache size” box (5 GB unless you change it), the cache can grow to that size.</w:t>
       </w:r>
     </w:p>
     <w:p>
@@ -299,7 +409,71 @@
           <w:rFonts w:ascii="Times New Roman" w:hAnsi="Times New Roman"/>
           <w:highlight w:val="white"/>
         </w:rPr>
-        <w:t xml:space="preserve">DreamGrid keeps the asset cache from growing too large. You set the limit on this screen.</w:t>
+        <w:t>- If the drive has less free space than that, the cache is kept to 1 GB.</w:t>
+      </w:r>
+    </w:p>
+    <w:p>
+      <w:pPr>
+        <w:ind w:left="720" w:right="720"/>
+        <w:rPr>
+          <w:rFonts w:ascii="Times New Roman" w:hAnsi="Times New Roman"/>
+          <w:highlight w:val="white"/>
+        </w:rPr>
+      </w:pPr>
+      <w:r>
+        <w:rPr>
+          <w:rFonts w:ascii="Times New Roman" w:hAnsi="Times New Roman"/>
+          <w:highlight w:val="white"/>
+        </w:rPr>
+        <w:t>- If the drive has less than 1 GB free, the cache is kept to the “% of free space” box (10 % unless you change it) of whatever space is left.</w:t>
+      </w:r>
+    </w:p>
+    <w:p>
+      <w:pPr>
+        <w:ind w:left="720" w:right="720"/>
+        <w:rPr>
+          <w:rFonts w:ascii="Times New Roman" w:hAnsi="Times New Roman"/>
+          <w:highlight w:val="white"/>
+        </w:rPr>
+      </w:pPr>
+      <w:r>
+        <w:rPr>
+          <w:rFonts w:ascii="Times New Roman" w:hAnsi="Times New Roman"/>
+          <w:highlight w:val="white"/>
+        </w:rPr>
+        <w:t>Deleting cache files is safe. When a region needs one of those assets again, it simply fetches it from the grid.</w:t>
+      </w:r>
+    </w:p>
+    <w:p>
+      <w:pPr>
+        <w:ind w:left="720" w:right="720"/>
+        <w:rPr>
+          <w:rFonts w:ascii="Times New Roman" w:hAnsi="Times New Roman"/>
+          <w:highlight w:val="white"/>
+        </w:rPr>
+      </w:pPr>
+      <w:r>
+        <w:rPr>
+          <w:rFonts w:ascii="Times New Roman" w:hAnsi="Times New Roman"/>
+          <w:highlight w:val="white"/>
+        </w:rPr>
+        <w:t>The Cache Directory box shows where the asset cache lives. Click the folder button to move it, for example to a bigger drive. The limit is then measured on that drive.</w:t>
+      </w:r>
+    </w:p>
+    <w:p>
+      <w:pPr>
+        <w:ind w:left="720" w:right="720"/>
+        <w:rPr>
+          <w:rFonts w:ascii="Times New Roman" w:hAnsi="Times New Roman"/>
+          <w:highlight w:val="white"/>
+        </w:rPr>
+      </w:pPr>
+      <w:r>
+        <w:rPr>
+          <w:rFonts w:ascii="Times New Roman" w:hAnsi="Times New Roman"/>
+          <w:highlight w:val="white"/>
+        </w:rPr>
+        <w:t>Older versions of DreamGrid had a “Timeout in hours” box instead. It is gone. OpenSimulator no longer cleans the cache itself: every region did it at the same moment, they got in each other’s way, and the logs filled with “Access to the path is denied” warnings.</w:t>
       </w:r>
     </w:p>
     <w:p>
@@ -307,7 +481,7 @@
         <w:pStyle w:val="Heading2"/>
       </w:pPr>
       <w:r>
-        <w:t>How big the asset cache can get</w:t>
+        <w:t>General principles</w:t>
       </w:r>
     </w:p>
     <w:p>
@@ -323,7 +497,63 @@
           <w:rFonts w:ascii="Times New Roman" w:hAnsi="Times New Roman"/>
           <w:highlight w:val="white"/>
         </w:rPr>
-        <w:t xml:space="preserve">All of your regions share one asset cache. Every 15 minutes, DreamGrid checks how big it is. If it is over the limit, DreamGrid deletes the files that have gone unused the longest, until the cache is a little under the limit.</w:t>
+        <w:t>When OpenSimulator requires an asset (</w:t>
+      </w:r>
+      <w:r>
+        <w:rPr>
+          <w:rFonts w:ascii="Times New Roman" w:hAnsi="Times New Roman"/>
+          <w:highlight w:val="white"/>
+        </w:rPr>
+        <w:t>e.g.,</w:t>
+      </w:r>
+      <w:r>
+        <w:rPr>
+          <w:rFonts w:ascii="Times New Roman" w:hAnsi="Times New Roman"/>
+          <w:highlight w:val="white"/>
+        </w:rPr>
+        <w:t xml:space="preserve"> in response to a viewer request for a </w:t>
+      </w:r>
+      <w:r>
+        <w:rPr>
+          <w:rFonts w:ascii="Times New Roman" w:hAnsi="Times New Roman"/>
+          <w:highlight w:val="white"/>
+        </w:rPr>
+        <w:t>note card</w:t>
+      </w:r>
+      <w:r>
+        <w:rPr>
+          <w:rFonts w:ascii="Times New Roman" w:hAnsi="Times New Roman"/>
+          <w:highlight w:val="white"/>
+        </w:rPr>
+        <w:t xml:space="preserve">), then it first asks the cache for this data. If the data is not found in the cache, then it asks the grid asset service (or </w:t>
+      </w:r>
+      <w:r>
+        <w:rPr>
+          <w:rFonts w:ascii="Times New Roman" w:hAnsi="Times New Roman"/>
+          <w:highlight w:val="white"/>
+        </w:rPr>
+        <w:t>a</w:t>
+      </w:r>
+      <w:r>
+        <w:rPr>
+          <w:rFonts w:ascii="Times New Roman" w:hAnsi="Times New Roman"/>
+          <w:highlight w:val="white"/>
+        </w:rPr>
+        <w:t xml:space="preserve"> foreign asset service in the case of Hypergrid). If the asset is </w:t>
+      </w:r>
+      <w:r>
+        <w:rPr>
+          <w:rFonts w:ascii="Times New Roman" w:hAnsi="Times New Roman"/>
+          <w:highlight w:val="white"/>
+        </w:rPr>
+        <w:t>there,</w:t>
+      </w:r>
+      <w:r>
+        <w:rPr>
+          <w:rFonts w:ascii="Times New Roman" w:hAnsi="Times New Roman"/>
+          <w:highlight w:val="white"/>
+        </w:rPr>
+        <w:t xml:space="preserve"> then it is both stored in the cache and returned to the user.</w:t>
       </w:r>
     </w:p>
     <w:p>
@@ -339,216 +569,6 @@
           <w:rFonts w:ascii="Times New Roman" w:hAnsi="Times New Roman"/>
           <w:highlight w:val="white"/>
         </w:rPr>
-        <w:t xml:space="preserve">The limit depends on how much free space is left on the drive that holds the cache:</w:t>
-      </w:r>
-    </w:p>
-    <w:p>
-      <w:pPr>
-        <w:ind w:left="720" w:right="720"/>
-        <w:rPr>
-          <w:rFonts w:ascii="Times New Roman" w:hAnsi="Times New Roman"/>
-          <w:highlight w:val="white"/>
-        </w:rPr>
-      </w:pPr>
-      <w:r>
-        <w:rPr>
-          <w:rFonts w:ascii="Times New Roman" w:hAnsi="Times New Roman"/>
-          <w:highlight w:val="white"/>
-        </w:rPr>
-        <w:t xml:space="preserve">- If the drive has at least as much free space as the “GB largest cache size” box (5 GB unless you change it), the cache can grow to that size.</w:t>
-      </w:r>
-    </w:p>
-    <w:p>
-      <w:pPr>
-        <w:ind w:left="720" w:right="720"/>
-        <w:rPr>
-          <w:rFonts w:ascii="Times New Roman" w:hAnsi="Times New Roman"/>
-          <w:highlight w:val="white"/>
-        </w:rPr>
-      </w:pPr>
-      <w:r>
-        <w:rPr>
-          <w:rFonts w:ascii="Times New Roman" w:hAnsi="Times New Roman"/>
-          <w:highlight w:val="white"/>
-        </w:rPr>
-        <w:t xml:space="preserve">- If the drive has less free space than that, the cache is kept to 1 GB.</w:t>
-      </w:r>
-    </w:p>
-    <w:p>
-      <w:pPr>
-        <w:ind w:left="720" w:right="720"/>
-        <w:rPr>
-          <w:rFonts w:ascii="Times New Roman" w:hAnsi="Times New Roman"/>
-          <w:highlight w:val="white"/>
-        </w:rPr>
-      </w:pPr>
-      <w:r>
-        <w:rPr>
-          <w:rFonts w:ascii="Times New Roman" w:hAnsi="Times New Roman"/>
-          <w:highlight w:val="white"/>
-        </w:rPr>
-        <w:t xml:space="preserve">- If the drive has less than 1 GB free, the cache is kept to the “% of free space” box (10 % unless you change it) of whatever space is left.</w:t>
-      </w:r>
-    </w:p>
-    <w:p>
-      <w:pPr>
-        <w:ind w:left="720" w:right="720"/>
-        <w:rPr>
-          <w:rFonts w:ascii="Times New Roman" w:hAnsi="Times New Roman"/>
-          <w:highlight w:val="white"/>
-        </w:rPr>
-      </w:pPr>
-      <w:r>
-        <w:rPr>
-          <w:rFonts w:ascii="Times New Roman" w:hAnsi="Times New Roman"/>
-          <w:highlight w:val="white"/>
-        </w:rPr>
-        <w:t xml:space="preserve">Deleting cache files is safe. When a region needs one of those assets again, it simply fetches it from the grid.</w:t>
-      </w:r>
-    </w:p>
-    <w:p>
-      <w:pPr>
-        <w:ind w:left="720" w:right="720"/>
-        <w:rPr>
-          <w:rFonts w:ascii="Times New Roman" w:hAnsi="Times New Roman"/>
-          <w:highlight w:val="white"/>
-        </w:rPr>
-      </w:pPr>
-      <w:r>
-        <w:rPr>
-          <w:rFonts w:ascii="Times New Roman" w:hAnsi="Times New Roman"/>
-          <w:highlight w:val="white"/>
-        </w:rPr>
-        <w:t xml:space="preserve">The Cache Directory box shows where the asset cache lives. Click the folder button to move it, for example to a bigger drive. The limit is then measured on that drive.</w:t>
-      </w:r>
-    </w:p>
-    <w:p>
-      <w:pPr>
-        <w:ind w:left="720" w:right="720"/>
-        <w:rPr>
-          <w:rFonts w:ascii="Times New Roman" w:hAnsi="Times New Roman"/>
-          <w:highlight w:val="white"/>
-        </w:rPr>
-      </w:pPr>
-      <w:r>
-        <w:rPr>
-          <w:rFonts w:ascii="Times New Roman" w:hAnsi="Times New Roman"/>
-          <w:highlight w:val="white"/>
-        </w:rPr>
-        <w:t xml:space="preserve">Older versions of DreamGrid had a “Timeout in hours” box instead. It is gone. OpenSimulator no longer cleans the cache itself: every region did it at the same moment, they got in each other’s way, and the logs filled with “Access to the path is denied” warnings.</w:t>
-      </w:r>
-    </w:p>
-    <w:p>
-      <w:pPr>
-        <w:pStyle w:val="Heading2"/>
-      </w:pPr>
-      <w:r>
-        <w:t>General principles</w:t>
-      </w:r>
-    </w:p>
-    <w:p>
-      <w:pPr>
-        <w:ind w:left="720" w:right="720"/>
-        <w:rPr>
-          <w:rFonts w:ascii="Times New Roman" w:hAnsi="Times New Roman"/>
-          <w:highlight w:val="white"/>
-        </w:rPr>
-      </w:pPr>
-      <w:r>
-        <w:rPr>
-          <w:rFonts w:ascii="Times New Roman" w:hAnsi="Times New Roman"/>
-          <w:highlight w:val="white"/>
-        </w:rPr>
-        <w:t xml:space="preserve">When </w:t>
-      </w:r>
-      <w:proofErr w:type="gramStart"/>
-      <w:r>
-        <w:rPr>
-          <w:rFonts w:ascii="Times New Roman" w:hAnsi="Times New Roman"/>
-          <w:highlight w:val="white"/>
-        </w:rPr>
-        <w:t>OpenSimulator</w:t>
-      </w:r>
-      <w:proofErr w:type="gramEnd"/>
-      <w:r>
-        <w:rPr>
-          <w:rFonts w:ascii="Times New Roman" w:hAnsi="Times New Roman"/>
-          <w:highlight w:val="white"/>
-        </w:rPr>
-        <w:t xml:space="preserve"> </w:t>
-      </w:r>
-      <w:proofErr w:type="gramStart"/>
-      <w:r>
-        <w:rPr>
-          <w:rFonts w:ascii="Times New Roman" w:hAnsi="Times New Roman"/>
-          <w:highlight w:val="white"/>
-        </w:rPr>
-        <w:t>requires</w:t>
-      </w:r>
-      <w:proofErr w:type="gramEnd"/>
-      <w:r>
-        <w:rPr>
-          <w:rFonts w:ascii="Times New Roman" w:hAnsi="Times New Roman"/>
-          <w:highlight w:val="white"/>
-        </w:rPr>
-        <w:t xml:space="preserve"> an asset (</w:t>
-      </w:r>
-      <w:r>
-        <w:rPr>
-          <w:rFonts w:ascii="Times New Roman" w:hAnsi="Times New Roman"/>
-          <w:highlight w:val="white"/>
-        </w:rPr>
-        <w:t>e.g.,</w:t>
-      </w:r>
-      <w:r>
-        <w:rPr>
-          <w:rFonts w:ascii="Times New Roman" w:hAnsi="Times New Roman"/>
-          <w:highlight w:val="white"/>
-        </w:rPr>
-        <w:t xml:space="preserve"> in response to a viewer request for a notecard), then it first asks the cache for this data. If the data is not found in the cache, then it asks the grid asset service (or </w:t>
-      </w:r>
-      <w:r>
-        <w:rPr>
-          <w:rFonts w:ascii="Times New Roman" w:hAnsi="Times New Roman"/>
-          <w:highlight w:val="white"/>
-        </w:rPr>
-        <w:t>a</w:t>
-      </w:r>
-      <w:r>
-        <w:rPr>
-          <w:rFonts w:ascii="Times New Roman" w:hAnsi="Times New Roman"/>
-          <w:highlight w:val="white"/>
-        </w:rPr>
-        <w:t xml:space="preserve"> foreign asset service in the case of Hypergrid). If the asset is </w:t>
-      </w:r>
-      <w:r>
-        <w:rPr>
-          <w:rFonts w:ascii="Times New Roman" w:hAnsi="Times New Roman"/>
-          <w:highlight w:val="white"/>
-        </w:rPr>
-        <w:t>there,</w:t>
-      </w:r>
-      <w:r>
-        <w:rPr>
-          <w:rFonts w:ascii="Times New Roman" w:hAnsi="Times New Roman"/>
-          <w:highlight w:val="white"/>
-        </w:rPr>
-        <w:t xml:space="preserve"> then it is both stored in the cache and returned to the user.</w:t>
-      </w:r>
-    </w:p>
-    <w:p>
-      <w:pPr>
-        <w:ind w:left="720" w:right="720"/>
-        <w:rPr>
-          <w:rFonts w:ascii="Times New Roman" w:hAnsi="Times New Roman"/>
-          <w:highlight w:val="white"/>
-        </w:rPr>
-      </w:pPr>
-      <w:r>
-        <w:rPr>
-          <w:rFonts w:ascii="Times New Roman" w:hAnsi="Times New Roman"/>
-          <w:highlight w:val="white"/>
-        </w:rPr>
         <w:t>If an asset is uploaded to OpenSimulator (e.g.</w:t>
       </w:r>
       <w:r>
@@ -563,30 +583,14 @@
           <w:rFonts w:ascii="Times New Roman" w:hAnsi="Times New Roman"/>
           <w:highlight w:val="white"/>
         </w:rPr>
-        <w:t xml:space="preserve"> by the viewer uploading an animation), then the asset </w:t>
-      </w:r>
-      <w:proofErr w:type="gramStart"/>
-      <w:r>
-        <w:rPr>
-          <w:rFonts w:ascii="Times New Roman" w:hAnsi="Times New Roman"/>
-          <w:highlight w:val="white"/>
-        </w:rPr>
-        <w:t xml:space="preserve">is </w:t>
-      </w:r>
-      <w:r>
-        <w:rPr>
-          <w:rFonts w:ascii="Times New Roman" w:hAnsi="Times New Roman"/>
-          <w:highlight w:val="white"/>
-        </w:rPr>
-        <w:t>at</w:t>
-      </w:r>
-      <w:proofErr w:type="gramEnd"/>
-      <w:r>
-        <w:rPr>
-          <w:rFonts w:ascii="Times New Roman" w:hAnsi="Times New Roman"/>
-          <w:highlight w:val="white"/>
-        </w:rPr>
-        <w:t xml:space="preserve"> </w:t>
+        <w:t xml:space="preserve"> by the viewer uploading an animation), then the asset is </w:t>
+      </w:r>
+      <w:r>
+        <w:rPr>
+          <w:rFonts w:ascii="Times New Roman" w:hAnsi="Times New Roman"/>
+          <w:highlight w:val="white"/>
+        </w:rPr>
+        <w:t xml:space="preserve">at </w:t>
       </w:r>
       <w:r>
         <w:rPr>
@@ -649,7 +653,7 @@
 </file>
 
 <file path=word/styles.xml><?xml version="1.0" encoding="utf-8"?>
-<w:styles xmlns:mc="http://schemas.openxmlformats.org/markup-compatibility/2006" xmlns:r="http://schemas.openxmlformats.org/officeDocument/2006/relationships" xmlns:w="http://schemas.openxmlformats.org/wordprocessingml/2006/main" xmlns:w14="http://schemas.microsoft.com/office/word/2010/wordml" xmlns:w15="http://schemas.microsoft.com/office/word/2012/wordml" xmlns:w16cex="http://schemas.microsoft.com/office/word/2018/wordml/cex" xmlns:w16cid="http://schemas.microsoft.com/office/word/2016/wordml/cid" xmlns:w16="http://schemas.microsoft.com/office/word/2018/wordml" xmlns:w16du="http://schemas.microsoft.com/office/word/2023/wordml/word16du" xmlns:w16sdtdh="http://schemas.microsoft.com/office/word/2020/wordml/sdtdatahash" xmlns:w16se="http://schemas.microsoft.com/office/word/2015/wordml/symex" mc:Ignorable="w14 w15 w16se w16cid w16 w16cex w16sdtdh w16du">
+<w:styles xmlns:mc="http://schemas.openxmlformats.org/markup-compatibility/2006" xmlns:r="http://schemas.openxmlformats.org/officeDocument/2006/relationships" xmlns:w="http://schemas.openxmlformats.org/wordprocessingml/2006/main" xmlns:w14="http://schemas.microsoft.com/office/word/2010/wordml" xmlns:w15="http://schemas.microsoft.com/office/word/2012/wordml" xmlns:w16cex="http://schemas.microsoft.com/office/word/2018/wordml/cex" xmlns:w16cid="http://schemas.microsoft.com/office/word/2016/wordml/cid" xmlns:w16="http://schemas.microsoft.com/office/word/2018/wordml" xmlns:w16du="http://schemas.microsoft.com/office/word/2023/wordml/word16du" xmlns:w16sdtdh="http://schemas.microsoft.com/office/word/2020/wordml/sdtdatahash" xmlns:w16sdtfl="http://schemas.microsoft.com/office/word/2024/wordml/sdtformatlock" xmlns:w16se="http://schemas.microsoft.com/office/word/2015/wordml/symex" mc:Ignorable="w14 w15 w16se w16cid w16 w16cex w16sdtdh w16sdtfl w16du">
   <w:docDefaults>
     <w:rPrDefault>
       <w:rPr>

</xml_diff>